<commit_message>
docs: tighten Longformer trigger wording; EDA report spacing
- eval_report.qmd Methods table: "misses target by more than 3 F1
  points" was ambiguous across the four metrics listed in the
  Headline Metrics table. Tightened to "misses the Micro F1 target
  (>= 0.70) by more than 3 points" so the fallback rule matches
  DECISIONS.md and model_card.md verbatim.
- EDA_Report.docx: added blank paragraphs before the References
  section for paper-style vertical spacing. Content unchanged.

Why: caught during post-merge review of feat/verify-mullenbach.
The Longformer trigger is a single concrete rule — Micro F1 < 0.67
— and all three docs (DECISIONS, model card, eval report) should
state it identically so a reader can't misread the eval report as
"any F1 target" triggering escalation.

Co-Authored-By: Claude Opus 4.7 (1M context) <noreply@anthropic.com>
</commit_message>
<xml_diff>
--- a/reports/EDA_Report.docx
+++ b/reports/EDA_Report.docx
@@ -670,7 +670,21 @@
         <w:rPr>
           <w:rFonts w:ascii="Times New Roman" w:hAnsi="Times New Roman" w:cs="Times New Roman"/>
         </w:rPr>
-        <w:t>This study focuses on a more recent benchmark setup: MIMIC-IV-Note v2.2 discharge summaries joined with MIMIC-IV v3.1 hospital diagnoses, filtered to ICD-10 admissions and a top-50 label space. The immediate objective is not to report model performance. It is to determine whether the available data support a credible auto-coding benchmark and to surface the non-negotiable design constraints before training begins.</w:t>
+        <w:t xml:space="preserve">This study focuses on a more recent benchmark setup: MIMIC-IV-Note v2.2 discharge summaries joined with MIMIC-IV v3.1 hospital diagnoses, filtered to ICD-10 admissions and a top-50 label space. The immediate objective is not to </w:t>
+      </w:r>
+      <w:proofErr w:type="gramStart"/>
+      <w:r>
+        <w:rPr>
+          <w:rFonts w:ascii="Times New Roman" w:hAnsi="Times New Roman" w:cs="Times New Roman"/>
+        </w:rPr>
+        <w:t>report</w:t>
+      </w:r>
+      <w:proofErr w:type="gramEnd"/>
+      <w:r>
+        <w:rPr>
+          <w:rFonts w:ascii="Times New Roman" w:hAnsi="Times New Roman" w:cs="Times New Roman"/>
+        </w:rPr>
+        <w:t xml:space="preserve"> model performance. It is to determine whether the available data support a credible auto-coding benchmark and to surface the non-negotiable design constraints before training begins.</w:t>
       </w:r>
     </w:p>
     <w:p>
@@ -685,7 +699,21 @@
           <w:rFonts w:ascii="Times New Roman" w:hAnsi="Times New Roman" w:cs="Times New Roman"/>
         </w:rPr>
         <w:lastRenderedPageBreak/>
-        <w:t>The central research question is whether a chunked Bio_ClinicalBERT pipeline can plausibly exceed the CAML benchmark when trained on a larger, newer MIMIC-IV cohort with ICD-10 labels. That question is worth asking only if the data support it. This paper therefore contributes the part that weak project reports usually skip: cohort construction logic, label-space characterization, note-length analysis, split methodology, and the EDA evidence used to justify the downstream modeling plan.</w:t>
+        <w:t xml:space="preserve">The central research question is whether a chunked Bio_ClinicalBERT pipeline can plausibly exceed the CAML benchmark when trained on a larger, newer MIMIC-IV cohort with ICD-10 labels. That question is worth asking only if the data </w:t>
+      </w:r>
+      <w:proofErr w:type="gramStart"/>
+      <w:r>
+        <w:rPr>
+          <w:rFonts w:ascii="Times New Roman" w:hAnsi="Times New Roman" w:cs="Times New Roman"/>
+        </w:rPr>
+        <w:t>support</w:t>
+      </w:r>
+      <w:proofErr w:type="gramEnd"/>
+      <w:r>
+        <w:rPr>
+          <w:rFonts w:ascii="Times New Roman" w:hAnsi="Times New Roman" w:cs="Times New Roman"/>
+        </w:rPr>
+        <w:t xml:space="preserve"> it. This paper therefore contributes the part that weak project reports usually skip: cohort construction logic, label-space characterization, note-length analysis, split methodology, and the EDA evidence used to justify the downstream modeling plan.</w:t>
       </w:r>
     </w:p>
     <w:p>
@@ -769,72 +797,21 @@
           <w:szCs w:val="24"/>
           <w:lang w:val="fr-FR"/>
         </w:rPr>
-        <w:t xml:space="preserve">2.2 </w:t>
-      </w:r>
-      <w:proofErr w:type="spellStart"/>
-      <w:r>
-        <w:rPr>
-          <w:rFonts w:ascii="Times New Roman" w:hAnsi="Times New Roman" w:cs="Times New Roman"/>
-          <w:sz w:val="24"/>
-          <w:szCs w:val="24"/>
+        <w:t>2.2 Clinical Language Models</w:t>
+      </w:r>
+    </w:p>
+    <w:p>
+      <w:pPr>
+        <w:pStyle w:val="FirstParagraph"/>
+        <w:rPr>
+          <w:rFonts w:ascii="Times New Roman" w:hAnsi="Times New Roman" w:cs="Times New Roman"/>
+        </w:rPr>
+      </w:pPr>
+      <w:r>
+        <w:rPr>
+          <w:rFonts w:ascii="Times New Roman" w:hAnsi="Times New Roman" w:cs="Times New Roman"/>
           <w:lang w:val="fr-FR"/>
         </w:rPr>
-        <w:t>Clinical</w:t>
-      </w:r>
-      <w:proofErr w:type="spellEnd"/>
-      <w:r>
-        <w:rPr>
-          <w:rFonts w:ascii="Times New Roman" w:hAnsi="Times New Roman" w:cs="Times New Roman"/>
-          <w:sz w:val="24"/>
-          <w:szCs w:val="24"/>
-          <w:lang w:val="fr-FR"/>
-        </w:rPr>
-        <w:t xml:space="preserve"> </w:t>
-      </w:r>
-      <w:proofErr w:type="spellStart"/>
-      <w:r>
-        <w:rPr>
-          <w:rFonts w:ascii="Times New Roman" w:hAnsi="Times New Roman" w:cs="Times New Roman"/>
-          <w:sz w:val="24"/>
-          <w:szCs w:val="24"/>
-          <w:lang w:val="fr-FR"/>
-        </w:rPr>
-        <w:t>Language</w:t>
-      </w:r>
-      <w:proofErr w:type="spellEnd"/>
-      <w:r>
-        <w:rPr>
-          <w:rFonts w:ascii="Times New Roman" w:hAnsi="Times New Roman" w:cs="Times New Roman"/>
-          <w:sz w:val="24"/>
-          <w:szCs w:val="24"/>
-          <w:lang w:val="fr-FR"/>
-        </w:rPr>
-        <w:t xml:space="preserve"> </w:t>
-      </w:r>
-      <w:proofErr w:type="spellStart"/>
-      <w:r>
-        <w:rPr>
-          <w:rFonts w:ascii="Times New Roman" w:hAnsi="Times New Roman" w:cs="Times New Roman"/>
-          <w:sz w:val="24"/>
-          <w:szCs w:val="24"/>
-          <w:lang w:val="fr-FR"/>
-        </w:rPr>
-        <w:t>Models</w:t>
-      </w:r>
-      <w:proofErr w:type="spellEnd"/>
-    </w:p>
-    <w:p>
-      <w:pPr>
-        <w:pStyle w:val="FirstParagraph"/>
-        <w:rPr>
-          <w:rFonts w:ascii="Times New Roman" w:hAnsi="Times New Roman" w:cs="Times New Roman"/>
-        </w:rPr>
-      </w:pPr>
-      <w:r>
-        <w:rPr>
-          <w:rFonts w:ascii="Times New Roman" w:hAnsi="Times New Roman" w:cs="Times New Roman"/>
-          <w:lang w:val="fr-FR"/>
-        </w:rPr>
         <w:t>Devlin et al. </w:t>
       </w:r>
       <w:r>
@@ -851,19 +828,25 @@
           <w:rFonts w:ascii="Times New Roman" w:hAnsi="Times New Roman" w:cs="Times New Roman"/>
         </w:rPr>
       </w:pPr>
-      <w:proofErr w:type="spellStart"/>
-      <w:r>
-        <w:rPr>
-          <w:rFonts w:ascii="Times New Roman" w:hAnsi="Times New Roman" w:cs="Times New Roman"/>
-        </w:rPr>
-        <w:t>Alsentzer</w:t>
-      </w:r>
-      <w:proofErr w:type="spellEnd"/>
-      <w:r>
-        <w:rPr>
-          <w:rFonts w:ascii="Times New Roman" w:hAnsi="Times New Roman" w:cs="Times New Roman"/>
-        </w:rPr>
-        <w:t xml:space="preserve"> et al. (2019) adapted BERT to clinical language through continued pretraining on MIMIC notes, producing Bio_ClinicalBERT. That makes it a sensible primary encoder for this study. The choice is practical rather than fashionable: a clinically adapted model is more appropriate than general-domain BERT, and it can be deployed in a chunked setup without immediately paying the computational cost of a long-context architecture.</w:t>
+      <w:r>
+        <w:rPr>
+          <w:rFonts w:ascii="Times New Roman" w:hAnsi="Times New Roman" w:cs="Times New Roman"/>
+        </w:rPr>
+        <w:t xml:space="preserve">Alsentzer et al. (2019) adapted BERT to clinical language through continued pretraining on MIMIC notes, producing Bio_ClinicalBERT. That makes it a sensible primary encoder for this study. The choice is practical rather than fashionable: a clinically adapted model is more appropriate than general-domain BERT, and it can be deployed in a chunked setup without immediately paying the computational cost of </w:t>
+      </w:r>
+      <w:proofErr w:type="gramStart"/>
+      <w:r>
+        <w:rPr>
+          <w:rFonts w:ascii="Times New Roman" w:hAnsi="Times New Roman" w:cs="Times New Roman"/>
+        </w:rPr>
+        <w:t>a long</w:t>
+      </w:r>
+      <w:proofErr w:type="gramEnd"/>
+      <w:r>
+        <w:rPr>
+          <w:rFonts w:ascii="Times New Roman" w:hAnsi="Times New Roman" w:cs="Times New Roman"/>
+        </w:rPr>
+        <w:t>-context architecture.</w:t>
       </w:r>
     </w:p>
     <w:p>
@@ -877,7 +860,21 @@
         <w:rPr>
           <w:rFonts w:ascii="Times New Roman" w:hAnsi="Times New Roman" w:cs="Times New Roman"/>
         </w:rPr>
-        <w:t>Beltagy et al. (2020) introduced Longformer as a way to extend usable context through sliding-window attention. That design is relevant here because discharge summaries are long, but the trade-off is straightforward: longer context comes with greater training cost. Accordingly, this paper treats Longformer as a conditional escalation path rather than the default starting point.</w:t>
+        <w:t xml:space="preserve">Beltagy et al. (2020) introduced Longformer </w:t>
+      </w:r>
+      <w:proofErr w:type="gramStart"/>
+      <w:r>
+        <w:rPr>
+          <w:rFonts w:ascii="Times New Roman" w:hAnsi="Times New Roman" w:cs="Times New Roman"/>
+        </w:rPr>
+        <w:t>as a way to</w:t>
+      </w:r>
+      <w:proofErr w:type="gramEnd"/>
+      <w:r>
+        <w:rPr>
+          <w:rFonts w:ascii="Times New Roman" w:hAnsi="Times New Roman" w:cs="Times New Roman"/>
+        </w:rPr>
+        <w:t xml:space="preserve"> extend usable context through sliding-window attention. That design is relevant here because discharge summaries are long, but the trade-off is straightforward: longer context comes with greater training cost. Accordingly, this paper treats Longformer as a conditional escalation path rather than the default starting point.</w:t>
       </w:r>
     </w:p>
     <w:p>
@@ -943,7 +940,21 @@
         <w:rPr>
           <w:rFonts w:ascii="Times New Roman" w:hAnsi="Times New Roman" w:cs="Times New Roman"/>
         </w:rPr>
-        <w:t xml:space="preserve"> remains a stable encounter key across releases. The notes are deidentified through redaction and date shifting, which protects privacy but also introduces analysis artifacts that must be handled explicitly.</w:t>
+        <w:t xml:space="preserve"> remains a stable encounter key across releases. The notes are deidentified through redaction and date shifting, which protects privacy but also introduces </w:t>
+      </w:r>
+      <w:proofErr w:type="gramStart"/>
+      <w:r>
+        <w:rPr>
+          <w:rFonts w:ascii="Times New Roman" w:hAnsi="Times New Roman" w:cs="Times New Roman"/>
+        </w:rPr>
+        <w:t>analysis artifacts</w:t>
+      </w:r>
+      <w:proofErr w:type="gramEnd"/>
+      <w:r>
+        <w:rPr>
+          <w:rFonts w:ascii="Times New Roman" w:hAnsi="Times New Roman" w:cs="Times New Roman"/>
+        </w:rPr>
+        <w:t xml:space="preserve"> that must be handled explicitly.</w:t>
       </w:r>
     </w:p>
     <w:p>
@@ -989,21 +1000,7 @@
         <w:rPr>
           <w:rFonts w:ascii="Times New Roman" w:hAnsi="Times New Roman" w:cs="Times New Roman"/>
         </w:rPr>
-        <w:t>Model Cards (Mitchell et al., 2019) and Data Cards (</w:t>
-      </w:r>
-      <w:proofErr w:type="spellStart"/>
-      <w:r>
-        <w:rPr>
-          <w:rFonts w:ascii="Times New Roman" w:hAnsi="Times New Roman" w:cs="Times New Roman"/>
-        </w:rPr>
-        <w:t>Pushkarna</w:t>
-      </w:r>
-      <w:proofErr w:type="spellEnd"/>
-      <w:r>
-        <w:rPr>
-          <w:rFonts w:ascii="Times New Roman" w:hAnsi="Times New Roman" w:cs="Times New Roman"/>
-        </w:rPr>
-        <w:t xml:space="preserve"> et al., 2022) are used here as reporting frameworks rather than as abstract ethics citations. Their relevance is direct: the cohort coverage, subgroup representation, and methodological limitations documented in this EDA are the evidence base for later model and data documentation. Without that groundwork, any “responsible AI” section would be superficial.</w:t>
+        <w:t>Model Cards (Mitchell et al., 2019) and Data Cards (Pushkarna et al., 2022) are used here as reporting frameworks rather than as abstract ethics citations. Their relevance is direct: the cohort coverage, subgroup representation, and methodological limitations documented in this EDA are the evidence base for later model and data documentation. Without that groundwork, any “responsible AI” section would be superficial.</w:t>
       </w:r>
     </w:p>
     <w:p>
@@ -1055,7 +1052,6 @@
         </w:rPr>
         <w:t xml:space="preserve">This analysis draws on two MIMIC resources. The text component is MIMIC-IV-Note v2.2, which contains 331,793 discharge summaries keyed by </w:t>
       </w:r>
-      <w:proofErr w:type="spellStart"/>
       <w:r>
         <w:rPr>
           <w:rStyle w:val="VerbatimChar"/>
@@ -1063,7 +1059,6 @@
         </w:rPr>
         <w:t>subject_id</w:t>
       </w:r>
-      <w:proofErr w:type="spellEnd"/>
       <w:r>
         <w:rPr>
           <w:rFonts w:ascii="Times New Roman" w:hAnsi="Times New Roman" w:cs="Times New Roman"/>
@@ -1083,7 +1078,6 @@
         </w:rPr>
         <w:t xml:space="preserve"> and includes fields such as </w:t>
       </w:r>
-      <w:proofErr w:type="spellStart"/>
       <w:r>
         <w:rPr>
           <w:rStyle w:val="VerbatimChar"/>
@@ -1091,14 +1085,12 @@
         </w:rPr>
         <w:t>note_id</w:t>
       </w:r>
-      <w:proofErr w:type="spellEnd"/>
       <w:r>
         <w:rPr>
           <w:rFonts w:ascii="Times New Roman" w:hAnsi="Times New Roman" w:cs="Times New Roman"/>
         </w:rPr>
         <w:t xml:space="preserve">, </w:t>
       </w:r>
-      <w:proofErr w:type="spellStart"/>
       <w:r>
         <w:rPr>
           <w:rStyle w:val="VerbatimChar"/>
@@ -1106,14 +1098,12 @@
         </w:rPr>
         <w:t>note_type</w:t>
       </w:r>
-      <w:proofErr w:type="spellEnd"/>
       <w:r>
         <w:rPr>
           <w:rFonts w:ascii="Times New Roman" w:hAnsi="Times New Roman" w:cs="Times New Roman"/>
         </w:rPr>
         <w:t xml:space="preserve">, </w:t>
       </w:r>
-      <w:proofErr w:type="spellStart"/>
       <w:r>
         <w:rPr>
           <w:rStyle w:val="VerbatimChar"/>
@@ -1121,14 +1111,12 @@
         </w:rPr>
         <w:t>note_seq</w:t>
       </w:r>
-      <w:proofErr w:type="spellEnd"/>
       <w:r>
         <w:rPr>
           <w:rFonts w:ascii="Times New Roman" w:hAnsi="Times New Roman" w:cs="Times New Roman"/>
         </w:rPr>
         <w:t xml:space="preserve">, </w:t>
       </w:r>
-      <w:proofErr w:type="spellStart"/>
       <w:r>
         <w:rPr>
           <w:rStyle w:val="VerbatimChar"/>
@@ -1136,7 +1124,6 @@
         </w:rPr>
         <w:t>charttime</w:t>
       </w:r>
-      <w:proofErr w:type="spellEnd"/>
       <w:r>
         <w:rPr>
           <w:rFonts w:ascii="Times New Roman" w:hAnsi="Times New Roman" w:cs="Times New Roman"/>
@@ -1546,21 +1533,12 @@
                 <w:rFonts w:ascii="Times New Roman" w:hAnsi="Times New Roman" w:cs="Times New Roman"/>
               </w:rPr>
             </w:pPr>
-            <w:proofErr w:type="spellStart"/>
             <w:r>
               <w:rPr>
                 <w:rStyle w:val="VerbatimChar"/>
                 <w:rFonts w:ascii="Times New Roman" w:hAnsi="Times New Roman" w:cs="Times New Roman"/>
               </w:rPr>
-              <w:t>note_type</w:t>
-            </w:r>
-            <w:proofErr w:type="spellEnd"/>
-            <w:r>
-              <w:rPr>
-                <w:rStyle w:val="VerbatimChar"/>
-                <w:rFonts w:ascii="Times New Roman" w:hAnsi="Times New Roman" w:cs="Times New Roman"/>
-              </w:rPr>
-              <w:t xml:space="preserve"> == "DS"</w:t>
+              <w:t>note_type == "DS"</w:t>
             </w:r>
             <w:r>
               <w:rPr>
@@ -1661,7 +1639,6 @@
               </w:rPr>
               <w:t xml:space="preserve"> on latest </w:t>
             </w:r>
-            <w:proofErr w:type="spellStart"/>
             <w:r>
               <w:rPr>
                 <w:rStyle w:val="VerbatimChar"/>
@@ -1669,7 +1646,6 @@
               </w:rPr>
               <w:t>note_seq</w:t>
             </w:r>
-            <w:proofErr w:type="spellEnd"/>
           </w:p>
         </w:tc>
         <w:tc>
@@ -1917,21 +1893,12 @@
                 <w:rFonts w:ascii="Times New Roman" w:hAnsi="Times New Roman" w:cs="Times New Roman"/>
               </w:rPr>
             </w:pPr>
-            <w:proofErr w:type="spellStart"/>
             <w:r>
               <w:rPr>
                 <w:rStyle w:val="VerbatimChar"/>
                 <w:rFonts w:ascii="Times New Roman" w:hAnsi="Times New Roman" w:cs="Times New Roman"/>
               </w:rPr>
-              <w:t>n_tokens</w:t>
-            </w:r>
-            <w:proofErr w:type="spellEnd"/>
-            <w:r>
-              <w:rPr>
-                <w:rStyle w:val="VerbatimChar"/>
-                <w:rFonts w:ascii="Times New Roman" w:hAnsi="Times New Roman" w:cs="Times New Roman"/>
-              </w:rPr>
-              <w:t xml:space="preserve"> &gt;= 100</w:t>
+              <w:t>n_tokens &gt;= 100</w:t>
             </w:r>
             <w:r>
               <w:rPr>
@@ -2010,7 +1977,6 @@
         </w:rPr>
         <w:t xml:space="preserve">Train, validation, and test partitions are defined at the patient level using an 80/10/10 split by </w:t>
       </w:r>
-      <w:proofErr w:type="spellStart"/>
       <w:r>
         <w:rPr>
           <w:rStyle w:val="VerbatimChar"/>
@@ -2018,7 +1984,6 @@
         </w:rPr>
         <w:t>subject_id</w:t>
       </w:r>
-      <w:proofErr w:type="spellEnd"/>
       <w:r>
         <w:rPr>
           <w:rFonts w:ascii="Times New Roman" w:hAnsi="Times New Roman" w:cs="Times New Roman"/>
@@ -2874,7 +2839,21 @@
         <w:rPr>
           <w:rFonts w:ascii="Times New Roman" w:hAnsi="Times New Roman" w:cs="Times New Roman"/>
         </w:rPr>
-        <w:t>Constraints. The main constraints are also clear and nontrivial. Note length rules out single-window BERT. Patient overlap rules out admission-level random splitting. The v3.1 Hosp upgrade improves structured diagnosis integrity, but the ICD-10-only filter eliminates a large share of the note inventory because the older ICD-9 era is intentionally excluded. That is a cohort-definition trade-off, not a data-quality failure.</w:t>
+        <w:t xml:space="preserve">Constraints. The main constraints are also clear and nontrivial. Note length rules out single-window BERT. Patient </w:t>
+      </w:r>
+      <w:proofErr w:type="gramStart"/>
+      <w:r>
+        <w:rPr>
+          <w:rFonts w:ascii="Times New Roman" w:hAnsi="Times New Roman" w:cs="Times New Roman"/>
+        </w:rPr>
+        <w:t>overlap</w:t>
+      </w:r>
+      <w:proofErr w:type="gramEnd"/>
+      <w:r>
+        <w:rPr>
+          <w:rFonts w:ascii="Times New Roman" w:hAnsi="Times New Roman" w:cs="Times New Roman"/>
+        </w:rPr>
+        <w:t xml:space="preserve"> rules out admission-level random splitting. The v3.1 Hosp upgrade improves structured diagnosis integrity, but the ICD-10-only filter eliminates a large share of the note inventory because the older ICD-9 era is intentionally excluded. That is a cohort-definition trade-off, not a data-quality failure.</w:t>
       </w:r>
     </w:p>
     <w:p>
@@ -2927,21 +2906,7 @@
           <w:rFonts w:ascii="Times New Roman" w:hAnsi="Times New Roman" w:cs="Times New Roman"/>
         </w:rPr>
         <w:lastRenderedPageBreak/>
-        <w:t xml:space="preserve">less frequent labels. Precision at rank is included because coder-assist settings care about the usefulness of the ranked candidate list, not only </w:t>
-      </w:r>
-      <w:proofErr w:type="spellStart"/>
-      <w:r>
-        <w:rPr>
-          <w:rFonts w:ascii="Times New Roman" w:hAnsi="Times New Roman" w:cs="Times New Roman"/>
-        </w:rPr>
-        <w:t>thresholded</w:t>
-      </w:r>
-      <w:proofErr w:type="spellEnd"/>
-      <w:r>
-        <w:rPr>
-          <w:rFonts w:ascii="Times New Roman" w:hAnsi="Times New Roman" w:cs="Times New Roman"/>
-        </w:rPr>
-        <w:t xml:space="preserve"> binary outputs.</w:t>
+        <w:t>less frequent labels. Precision at rank is included because coder-assist settings care about the usefulness of the ranked candidate list, not only thresholded binary outputs.</w:t>
       </w:r>
     </w:p>
     <w:p>
@@ -3381,6 +3346,33 @@
     </w:p>
     <w:p>
       <w:pPr>
+        <w:rPr>
+          <w:rFonts w:ascii="Times New Roman" w:hAnsi="Times New Roman" w:cs="Times New Roman"/>
+          <w:sz w:val="24"/>
+          <w:szCs w:val="24"/>
+        </w:rPr>
+      </w:pPr>
+    </w:p>
+    <w:p>
+      <w:pPr>
+        <w:rPr>
+          <w:rFonts w:ascii="Times New Roman" w:hAnsi="Times New Roman" w:cs="Times New Roman"/>
+          <w:sz w:val="24"/>
+          <w:szCs w:val="24"/>
+        </w:rPr>
+      </w:pPr>
+    </w:p>
+    <w:p>
+      <w:pPr>
+        <w:rPr>
+          <w:rFonts w:ascii="Times New Roman" w:hAnsi="Times New Roman" w:cs="Times New Roman"/>
+          <w:sz w:val="24"/>
+          <w:szCs w:val="24"/>
+        </w:rPr>
+      </w:pPr>
+    </w:p>
+    <w:p>
+      <w:pPr>
         <w:pStyle w:val="Heading1"/>
         <w:rPr>
           <w:rFonts w:ascii="Times New Roman" w:hAnsi="Times New Roman" w:cs="Times New Roman"/>
@@ -3407,19 +3399,11 @@
           <w:color w:val="000000"/>
         </w:rPr>
       </w:pPr>
-      <w:proofErr w:type="spellStart"/>
       <w:r>
         <w:rPr>
           <w:color w:val="000000"/>
         </w:rPr>
-        <w:t>Alsentzer</w:t>
-      </w:r>
-      <w:proofErr w:type="spellEnd"/>
-      <w:r>
-        <w:rPr>
-          <w:color w:val="000000"/>
-        </w:rPr>
-        <w:t>, E., Murphy, J. R., Boag, W., Weng, W.-H., Jin, D., Naumann, T., &amp; McDermott, M. (2019). Publicly available clinical BERT embeddings. </w:t>
+        <w:t>Alsentzer, E., Murphy, J. R., Boag, W., Weng, W.-H., Jin, D., Naumann, T., &amp; McDermott, M. (2019). Publicly available clinical BERT embeddings. </w:t>
       </w:r>
       <w:r>
         <w:rPr>
@@ -3505,7 +3489,21 @@
         <w:rPr>
           <w:color w:val="000000"/>
         </w:rPr>
-        <w:t>Devlin, J., Chang, M.-W., Lee, K., &amp; Toutanova, K. (2019). BERT: Pre-training of deep bidirectional transformers for language understanding. </w:t>
+        <w:t>Devlin, J., Chang, M.-W., Lee, K., &amp; Toutanova, K. (2019). BERT: Pre-</w:t>
+      </w:r>
+      <w:proofErr w:type="gramStart"/>
+      <w:r>
+        <w:rPr>
+          <w:color w:val="000000"/>
+        </w:rPr>
+        <w:t>training of</w:t>
+      </w:r>
+      <w:proofErr w:type="gramEnd"/>
+      <w:r>
+        <w:rPr>
+          <w:color w:val="000000"/>
+        </w:rPr>
+        <w:t xml:space="preserve"> deep bidirectional transformers for language understanding. </w:t>
       </w:r>
       <w:r>
         <w:rPr>
@@ -3721,21 +3719,12 @@
           <w:color w:val="000000"/>
         </w:rPr>
       </w:pPr>
-      <w:proofErr w:type="spellStart"/>
       <w:r>
         <w:rPr>
           <w:color w:val="000000"/>
           <w:lang w:val="es-ES"/>
         </w:rPr>
-        <w:t>Pushkarna</w:t>
-      </w:r>
-      <w:proofErr w:type="spellEnd"/>
-      <w:r>
-        <w:rPr>
-          <w:color w:val="000000"/>
-          <w:lang w:val="es-ES"/>
-        </w:rPr>
-        <w:t xml:space="preserve">, M., Zaldivar, A., &amp; Kjartansson, O. (2022). </w:t>
+        <w:t xml:space="preserve">Pushkarna, M., Zaldivar, A., &amp; Kjartansson, O. (2022). </w:t>
       </w:r>
       <w:r>
         <w:rPr>
@@ -4631,7 +4620,6 @@
         </w:rPr>
         <w:t xml:space="preserve"> as the stable encounter key. The final modelable cohort retained admissions with discharge-summary text, valid admission records, and at least one ICD-10 diagnosis code. Train, validation, and test splits were performed at the patient level using </w:t>
       </w:r>
-      <w:proofErr w:type="spellStart"/>
       <w:r>
         <w:rPr>
           <w:rStyle w:val="VerbatimChar"/>
@@ -4639,7 +4627,6 @@
         </w:rPr>
         <w:t>subject_id</w:t>
       </w:r>
-      <w:proofErr w:type="spellEnd"/>
       <w:r>
         <w:rPr>
           <w:rFonts w:ascii="Times New Roman" w:hAnsi="Times New Roman" w:cs="Times New Roman"/>
@@ -8006,6 +7993,7 @@
   <w:rsids>
     <w:rsidRoot w:val="0053486F"/>
     <w:rsid w:val="00023F30"/>
+    <w:rsid w:val="000931D0"/>
     <w:rsid w:val="000A1ABC"/>
     <w:rsid w:val="001B6A4A"/>
     <w:rsid w:val="002D2D36"/>
@@ -8015,6 +8003,7 @@
     <w:rsid w:val="00572626"/>
     <w:rsid w:val="005F1326"/>
     <w:rsid w:val="00667296"/>
+    <w:rsid w:val="00687400"/>
     <w:rsid w:val="0071131B"/>
     <w:rsid w:val="00854516"/>
     <w:rsid w:val="008B3169"/>

</xml_diff>